<commit_message>
Updated code of conduct
</commit_message>
<xml_diff>
--- a/docs/Code of Conduct.docx
+++ b/docs/Code of Conduct.docx
@@ -4,7 +4,7 @@
   <w:body>
     <w:p>
       <w:pPr>
-        <w:pStyle w:val="Title"/>
+        <w:pStyle w:val="Titel"/>
         <w:rPr>
           <w:lang w:val="en-US"/>
         </w:rPr>
@@ -31,7 +31,7 @@
     </w:p>
     <w:p>
       <w:pPr>
-        <w:pStyle w:val="Heading1"/>
+        <w:pStyle w:val="Kop1"/>
         <w:rPr>
           <w:lang w:val="en-GB"/>
         </w:rPr>
@@ -68,7 +68,7 @@
     </w:p>
     <w:p>
       <w:pPr>
-        <w:pStyle w:val="Heading1"/>
+        <w:pStyle w:val="Kop1"/>
         <w:rPr>
           <w:lang w:val="en-GB"/>
         </w:rPr>
@@ -82,7 +82,7 @@
     </w:p>
     <w:p>
       <w:pPr>
-        <w:pStyle w:val="ListParagraph"/>
+        <w:pStyle w:val="Lijstalinea"/>
         <w:numPr>
           <w:ilvl w:val="0"/>
           <w:numId w:val="2"/>
@@ -100,7 +100,7 @@
     </w:p>
     <w:p>
       <w:pPr>
-        <w:pStyle w:val="ListParagraph"/>
+        <w:pStyle w:val="Lijstalinea"/>
         <w:numPr>
           <w:ilvl w:val="0"/>
           <w:numId w:val="2"/>
@@ -118,7 +118,7 @@
     </w:p>
     <w:p>
       <w:pPr>
-        <w:pStyle w:val="ListParagraph"/>
+        <w:pStyle w:val="Lijstalinea"/>
         <w:numPr>
           <w:ilvl w:val="0"/>
           <w:numId w:val="2"/>
@@ -136,7 +136,7 @@
     </w:p>
     <w:p>
       <w:pPr>
-        <w:pStyle w:val="ListParagraph"/>
+        <w:pStyle w:val="Lijstalinea"/>
         <w:numPr>
           <w:ilvl w:val="0"/>
           <w:numId w:val="2"/>
@@ -154,7 +154,7 @@
     </w:p>
     <w:p>
       <w:pPr>
-        <w:pStyle w:val="ListParagraph"/>
+        <w:pStyle w:val="Lijstalinea"/>
         <w:numPr>
           <w:ilvl w:val="0"/>
           <w:numId w:val="2"/>
@@ -172,7 +172,7 @@
     </w:p>
     <w:p>
       <w:pPr>
-        <w:pStyle w:val="ListParagraph"/>
+        <w:pStyle w:val="Lijstalinea"/>
         <w:numPr>
           <w:ilvl w:val="0"/>
           <w:numId w:val="2"/>
@@ -190,7 +190,7 @@
     </w:p>
     <w:p>
       <w:pPr>
-        <w:pStyle w:val="Heading1"/>
+        <w:pStyle w:val="Kop1"/>
         <w:rPr>
           <w:lang w:val="en-GB"/>
         </w:rPr>
@@ -256,12 +256,24 @@
         <w:rPr>
           <w:lang w:val="en-GB"/>
         </w:rPr>
-        <w:t>create a task-scheduling app using various technologies and software.</w:t>
-      </w:r>
-    </w:p>
-    <w:p>
-      <w:pPr>
-        <w:pStyle w:val="Heading1"/>
+        <w:t>create a task-scheduling app using various technologies and software</w:t>
+      </w:r>
+      <w:r>
+        <w:rPr>
+          <w:lang w:val="en-GB"/>
+        </w:rPr>
+        <w:t>, of which we will most significantly use JavaFX, Gradle, Git and IntelliJ</w:t>
+      </w:r>
+      <w:r>
+        <w:rPr>
+          <w:lang w:val="en-GB"/>
+        </w:rPr>
+        <w:t>.</w:t>
+      </w:r>
+    </w:p>
+    <w:p>
+      <w:pPr>
+        <w:pStyle w:val="Kop1"/>
         <w:rPr>
           <w:lang w:val="en-GB"/>
         </w:rPr>
@@ -342,7 +354,7 @@
     </w:p>
     <w:p>
       <w:pPr>
-        <w:pStyle w:val="Heading1"/>
+        <w:pStyle w:val="Kop1"/>
         <w:rPr>
           <w:lang w:val="en-GB"/>
         </w:rPr>
@@ -382,7 +394,7 @@
     </w:p>
     <w:p>
       <w:pPr>
-        <w:pStyle w:val="Heading1"/>
+        <w:pStyle w:val="Kop1"/>
         <w:rPr>
           <w:lang w:val="en-GB"/>
         </w:rPr>
@@ -424,7 +436,7 @@
     </w:p>
     <w:p>
       <w:pPr>
-        <w:pStyle w:val="Heading1"/>
+        <w:pStyle w:val="Kop1"/>
         <w:rPr>
           <w:lang w:val="en-GB"/>
         </w:rPr>
@@ -464,15 +476,16 @@
     </w:p>
     <w:p>
       <w:pPr>
-        <w:pStyle w:val="Heading1"/>
-        <w:rPr>
-          <w:lang w:val="en-GB"/>
-        </w:rPr>
-      </w:pPr>
-      <w:r>
-        <w:rPr>
-          <w:lang w:val="en-GB"/>
-        </w:rPr>
+        <w:pStyle w:val="Kop1"/>
+        <w:rPr>
+          <w:lang w:val="en-GB"/>
+        </w:rPr>
+      </w:pPr>
+      <w:r>
+        <w:rPr>
+          <w:lang w:val="en-GB"/>
+        </w:rPr>
+        <w:lastRenderedPageBreak/>
         <w:t>Communication</w:t>
       </w:r>
     </w:p>
@@ -486,26 +499,12 @@
         <w:rPr>
           <w:lang w:val="en-GB"/>
         </w:rPr>
-        <w:t xml:space="preserve">We use Discord for online meetings so that we can collaborate while conversing with one another, while </w:t>
-      </w:r>
-      <w:proofErr w:type="spellStart"/>
-      <w:r>
-        <w:rPr>
-          <w:lang w:val="en-GB"/>
-        </w:rPr>
-        <w:t>Mattermost</w:t>
-      </w:r>
-      <w:proofErr w:type="spellEnd"/>
-      <w:r>
-        <w:rPr>
-          <w:lang w:val="en-GB"/>
-        </w:rPr>
-        <w:t xml:space="preserve"> and WhatsApp are both used for planning and deadline discussions.</w:t>
-      </w:r>
-    </w:p>
-    <w:p>
-      <w:pPr>
-        <w:pStyle w:val="Heading1"/>
+        <w:t>We use Discord for online meetings so that we can collaborate while conversing with one another, while Mattermost and WhatsApp are both used for planning and deadline discussions.</w:t>
+      </w:r>
+    </w:p>
+    <w:p>
+      <w:pPr>
+        <w:pStyle w:val="Kop1"/>
         <w:rPr>
           <w:lang w:val="en-GB"/>
         </w:rPr>
@@ -622,7 +621,7 @@
     </w:p>
     <w:p>
       <w:pPr>
-        <w:pStyle w:val="Heading1"/>
+        <w:pStyle w:val="Kop1"/>
         <w:rPr>
           <w:lang w:val="en-GB"/>
         </w:rPr>
@@ -664,7 +663,7 @@
     </w:p>
     <w:p>
       <w:pPr>
-        <w:pStyle w:val="Heading1"/>
+        <w:pStyle w:val="Kop1"/>
         <w:rPr>
           <w:lang w:val="en-GB"/>
         </w:rPr>
@@ -697,7 +696,7 @@
     </w:p>
     <w:p>
       <w:pPr>
-        <w:pStyle w:val="Heading1"/>
+        <w:pStyle w:val="Kop1"/>
         <w:rPr>
           <w:lang w:val="en-GB"/>
         </w:rPr>
@@ -754,7 +753,7 @@
     </w:p>
     <w:p>
       <w:pPr>
-        <w:pStyle w:val="Heading1"/>
+        <w:pStyle w:val="Kop1"/>
         <w:rPr>
           <w:lang w:val="en-GB"/>
         </w:rPr>
@@ -805,7 +804,7 @@
     </w:p>
     <w:p>
       <w:pPr>
-        <w:pStyle w:val="Heading1"/>
+        <w:pStyle w:val="Kop1"/>
         <w:rPr>
           <w:lang w:val="en-GB"/>
         </w:rPr>
@@ -880,7 +879,7 @@
     </w:p>
     <w:p>
       <w:pPr>
-        <w:pStyle w:val="Heading1"/>
+        <w:pStyle w:val="Kop1"/>
         <w:rPr>
           <w:lang w:val="en-GB"/>
         </w:rPr>
@@ -962,15 +961,16 @@
     </w:p>
     <w:p>
       <w:pPr>
-        <w:pStyle w:val="Heading1"/>
-        <w:rPr>
-          <w:lang w:val="en-GB"/>
-        </w:rPr>
-      </w:pPr>
-      <w:r>
-        <w:rPr>
-          <w:lang w:val="en-GB"/>
-        </w:rPr>
+        <w:pStyle w:val="Kop1"/>
+        <w:rPr>
+          <w:lang w:val="en-GB"/>
+        </w:rPr>
+      </w:pPr>
+      <w:r>
+        <w:rPr>
+          <w:lang w:val="en-GB"/>
+        </w:rPr>
+        <w:lastRenderedPageBreak/>
         <w:t>Success factors</w:t>
       </w:r>
     </w:p>
@@ -1037,7 +1037,7 @@
     </w:p>
     <w:p>
       <w:pPr>
-        <w:pStyle w:val="Heading1"/>
+        <w:pStyle w:val="Kop1"/>
         <w:rPr>
           <w:lang w:val="en-GB"/>
         </w:rPr>
@@ -1051,7 +1051,7 @@
     </w:p>
     <w:p>
       <w:pPr>
-        <w:pStyle w:val="ListParagraph"/>
+        <w:pStyle w:val="Lijstalinea"/>
         <w:numPr>
           <w:ilvl w:val="0"/>
           <w:numId w:val="3"/>
@@ -1075,7 +1075,7 @@
     </w:p>
     <w:p>
       <w:pPr>
-        <w:pStyle w:val="ListParagraph"/>
+        <w:pStyle w:val="Lijstalinea"/>
         <w:numPr>
           <w:ilvl w:val="0"/>
           <w:numId w:val="3"/>
@@ -1093,7 +1093,7 @@
     </w:p>
     <w:p>
       <w:pPr>
-        <w:pStyle w:val="ListParagraph"/>
+        <w:pStyle w:val="Lijstalinea"/>
         <w:numPr>
           <w:ilvl w:val="0"/>
           <w:numId w:val="3"/>
@@ -1111,7 +1111,7 @@
     </w:p>
     <w:p>
       <w:pPr>
-        <w:pStyle w:val="ListParagraph"/>
+        <w:pStyle w:val="Lijstalinea"/>
         <w:numPr>
           <w:ilvl w:val="0"/>
           <w:numId w:val="3"/>
@@ -1147,7 +1147,7 @@
     </w:p>
     <w:p>
       <w:pPr>
-        <w:pStyle w:val="ListParagraph"/>
+        <w:pStyle w:val="Lijstalinea"/>
         <w:numPr>
           <w:ilvl w:val="0"/>
           <w:numId w:val="3"/>
@@ -1256,7 +1256,7 @@
         </w:tcPr>
         <w:p>
           <w:pPr>
-            <w:pStyle w:val="Header"/>
+            <w:pStyle w:val="Koptekst"/>
             <w:ind w:left="-115"/>
           </w:pPr>
           <w:r>
@@ -1270,7 +1270,7 @@
         </w:tcPr>
         <w:p>
           <w:pPr>
-            <w:pStyle w:val="Header"/>
+            <w:pStyle w:val="Koptekst"/>
             <w:jc w:val="center"/>
           </w:pPr>
           <w:r>
@@ -1284,7 +1284,7 @@
         </w:tcPr>
         <w:p>
           <w:pPr>
-            <w:pStyle w:val="Header"/>
+            <w:pStyle w:val="Koptekst"/>
             <w:tabs>
               <w:tab w:val="left" w:pos="2146"/>
             </w:tabs>
@@ -1302,7 +1302,7 @@
   </w:tbl>
   <w:p>
     <w:pPr>
-      <w:pStyle w:val="Footer"/>
+      <w:pStyle w:val="Voettekst"/>
     </w:pPr>
   </w:p>
 </w:ftr>
@@ -1363,7 +1363,7 @@
         </w:tcPr>
         <w:p>
           <w:pPr>
-            <w:pStyle w:val="Header"/>
+            <w:pStyle w:val="Koptekst"/>
             <w:ind w:left="-115"/>
           </w:pPr>
         </w:p>
@@ -1374,7 +1374,7 @@
         </w:tcPr>
         <w:p>
           <w:pPr>
-            <w:pStyle w:val="Header"/>
+            <w:pStyle w:val="Koptekst"/>
             <w:jc w:val="center"/>
           </w:pPr>
         </w:p>
@@ -1385,7 +1385,7 @@
         </w:tcPr>
         <w:p>
           <w:pPr>
-            <w:pStyle w:val="Header"/>
+            <w:pStyle w:val="Koptekst"/>
             <w:ind w:right="-115"/>
             <w:jc w:val="right"/>
           </w:pPr>
@@ -1395,7 +1395,7 @@
   </w:tbl>
   <w:p>
     <w:pPr>
-      <w:pStyle w:val="Header"/>
+      <w:pStyle w:val="Koptekst"/>
     </w:pPr>
     <w:r>
       <w:rPr>
@@ -2226,15 +2226,15 @@
     <w:lsdException w:name="Unresolved Mention" w:semiHidden="1" w:unhideWhenUsed="1"/>
     <w:lsdException w:name="Smart Link" w:semiHidden="1" w:unhideWhenUsed="1"/>
   </w:latentStyles>
-  <w:style w:type="paragraph" w:default="1" w:styleId="Normal">
+  <w:style w:type="paragraph" w:default="1" w:styleId="Standaard">
     <w:name w:val="Normal"/>
     <w:qFormat/>
   </w:style>
-  <w:style w:type="paragraph" w:styleId="Heading1">
+  <w:style w:type="paragraph" w:styleId="Kop1">
     <w:name w:val="heading 1"/>
-    <w:basedOn w:val="Normal"/>
-    <w:next w:val="Normal"/>
-    <w:link w:val="Heading1Char"/>
+    <w:basedOn w:val="Standaard"/>
+    <w:next w:val="Standaard"/>
+    <w:link w:val="Kop1Char"/>
     <w:uiPriority w:val="9"/>
     <w:qFormat/>
     <w:pPr>
@@ -2250,13 +2250,13 @@
       <w:szCs w:val="32"/>
     </w:rPr>
   </w:style>
-  <w:style w:type="character" w:default="1" w:styleId="DefaultParagraphFont">
+  <w:style w:type="character" w:default="1" w:styleId="Standaardalinea-lettertype">
     <w:name w:val="Default Paragraph Font"/>
     <w:uiPriority w:val="1"/>
     <w:semiHidden/>
     <w:unhideWhenUsed/>
   </w:style>
-  <w:style w:type="table" w:default="1" w:styleId="TableNormal">
+  <w:style w:type="table" w:default="1" w:styleId="Standaardtabel">
     <w:name w:val="Normal Table"/>
     <w:uiPriority w:val="99"/>
     <w:semiHidden/>
@@ -2271,16 +2271,16 @@
       </w:tblCellMar>
     </w:tblPr>
   </w:style>
-  <w:style w:type="numbering" w:default="1" w:styleId="NoList">
+  <w:style w:type="numbering" w:default="1" w:styleId="Geenlijst">
     <w:name w:val="No List"/>
     <w:uiPriority w:val="99"/>
     <w:semiHidden/>
     <w:unhideWhenUsed/>
   </w:style>
-  <w:style w:type="character" w:customStyle="1" w:styleId="TitleChar">
-    <w:name w:val="Title Char"/>
-    <w:basedOn w:val="DefaultParagraphFont"/>
-    <w:link w:val="Title"/>
+  <w:style w:type="character" w:customStyle="1" w:styleId="TitelChar">
+    <w:name w:val="Titel Char"/>
+    <w:basedOn w:val="Standaardalinea-lettertype"/>
+    <w:link w:val="Titel"/>
     <w:uiPriority w:val="10"/>
     <w:rPr>
       <w:rFonts w:asciiTheme="majorHAnsi" w:eastAsiaTheme="majorEastAsia" w:hAnsiTheme="majorHAnsi" w:cstheme="majorBidi"/>
@@ -2290,11 +2290,11 @@
       <w:szCs w:val="56"/>
     </w:rPr>
   </w:style>
-  <w:style w:type="paragraph" w:styleId="Title">
+  <w:style w:type="paragraph" w:styleId="Titel">
     <w:name w:val="Title"/>
-    <w:basedOn w:val="Normal"/>
-    <w:next w:val="Normal"/>
-    <w:link w:val="TitleChar"/>
+    <w:basedOn w:val="Standaard"/>
+    <w:next w:val="Standaard"/>
+    <w:link w:val="TitelChar"/>
     <w:uiPriority w:val="10"/>
     <w:qFormat/>
     <w:pPr>
@@ -2309,10 +2309,10 @@
       <w:szCs w:val="56"/>
     </w:rPr>
   </w:style>
-  <w:style w:type="character" w:customStyle="1" w:styleId="Heading1Char">
-    <w:name w:val="Heading 1 Char"/>
-    <w:basedOn w:val="DefaultParagraphFont"/>
-    <w:link w:val="Heading1"/>
+  <w:style w:type="character" w:customStyle="1" w:styleId="Kop1Char">
+    <w:name w:val="Kop 1 Char"/>
+    <w:basedOn w:val="Standaardalinea-lettertype"/>
+    <w:link w:val="Kop1"/>
     <w:uiPriority w:val="9"/>
     <w:rPr>
       <w:rFonts w:asciiTheme="majorHAnsi" w:eastAsiaTheme="majorEastAsia" w:hAnsiTheme="majorHAnsi" w:cstheme="majorBidi"/>
@@ -2321,9 +2321,9 @@
       <w:szCs w:val="32"/>
     </w:rPr>
   </w:style>
-  <w:style w:type="paragraph" w:styleId="ListParagraph">
+  <w:style w:type="paragraph" w:styleId="Lijstalinea">
     <w:name w:val="List Paragraph"/>
-    <w:basedOn w:val="Normal"/>
+    <w:basedOn w:val="Standaard"/>
     <w:uiPriority w:val="34"/>
     <w:qFormat/>
     <w:pPr>
@@ -2333,7 +2333,7 @@
   </w:style>
   <w:style w:type="character" w:styleId="Hyperlink">
     <w:name w:val="Hyperlink"/>
-    <w:basedOn w:val="DefaultParagraphFont"/>
+    <w:basedOn w:val="Standaardalinea-lettertype"/>
     <w:uiPriority w:val="99"/>
     <w:unhideWhenUsed/>
     <w:rPr>
@@ -2341,9 +2341,9 @@
       <w:u w:val="single"/>
     </w:rPr>
   </w:style>
-  <w:style w:type="table" w:styleId="TableGrid">
+  <w:style w:type="table" w:styleId="Tabelraster">
     <w:name w:val="Table Grid"/>
-    <w:basedOn w:val="TableNormal"/>
+    <w:basedOn w:val="Standaardtabel"/>
     <w:uiPriority w:val="59"/>
     <w:rsid w:val="00FB4123"/>
     <w:pPr>
@@ -2360,16 +2360,16 @@
       </w:tblBorders>
     </w:tblPr>
   </w:style>
-  <w:style w:type="character" w:customStyle="1" w:styleId="HeaderChar">
-    <w:name w:val="Header Char"/>
-    <w:basedOn w:val="DefaultParagraphFont"/>
-    <w:link w:val="Header"/>
+  <w:style w:type="character" w:customStyle="1" w:styleId="KoptekstChar">
+    <w:name w:val="Koptekst Char"/>
+    <w:basedOn w:val="Standaardalinea-lettertype"/>
+    <w:link w:val="Koptekst"/>
     <w:uiPriority w:val="99"/>
   </w:style>
-  <w:style w:type="paragraph" w:styleId="Header">
+  <w:style w:type="paragraph" w:styleId="Koptekst">
     <w:name w:val="header"/>
-    <w:basedOn w:val="Normal"/>
-    <w:link w:val="HeaderChar"/>
+    <w:basedOn w:val="Standaard"/>
+    <w:link w:val="KoptekstChar"/>
     <w:uiPriority w:val="99"/>
     <w:unhideWhenUsed/>
     <w:pPr>
@@ -2380,16 +2380,16 @@
       <w:spacing w:after="0" w:line="240" w:lineRule="auto"/>
     </w:pPr>
   </w:style>
-  <w:style w:type="character" w:customStyle="1" w:styleId="FooterChar">
-    <w:name w:val="Footer Char"/>
-    <w:basedOn w:val="DefaultParagraphFont"/>
-    <w:link w:val="Footer"/>
+  <w:style w:type="character" w:customStyle="1" w:styleId="VoettekstChar">
+    <w:name w:val="Voettekst Char"/>
+    <w:basedOn w:val="Standaardalinea-lettertype"/>
+    <w:link w:val="Voettekst"/>
     <w:uiPriority w:val="99"/>
   </w:style>
-  <w:style w:type="paragraph" w:styleId="Footer">
+  <w:style w:type="paragraph" w:styleId="Voettekst">
     <w:name w:val="footer"/>
-    <w:basedOn w:val="Normal"/>
-    <w:link w:val="FooterChar"/>
+    <w:basedOn w:val="Standaard"/>
+    <w:link w:val="VoettekstChar"/>
     <w:uiPriority w:val="99"/>
     <w:unhideWhenUsed/>
     <w:pPr>

</xml_diff>